<commit_message>
Bring the A-4 planning evidence and the packs into line with the completed records
The planning evidence had three places still describing the review records as
unwritten, and its PDF was a stale export of an earlier docx (7 pages against a
docx that renders 8). Both are corrected: SR3 is now described as read back from
the sixteen commits in the increment, SR4 as recorded at the 20 October session
and tagged sr4-2026-10-20 at a0d8f55, SU3 as blank because 12 October carries no
project commit, and the lessons table no longer says SR4 had one field and no
date. The PDF is re-exported so the pair matches at 8 pages.

The submission index, the group plan and the sprint 3-4 plan are corrected the
same way, and the sprint 3-4 plan now names both review snapshots. The index
still holds two pages.
</commit_message>
<xml_diff>
--- a/submissions/AISD/AISD_Planning_Evidence.docx
+++ b/submissions/AISD/AISD_Planning_Evidence.docx
@@ -3320,26 +3320,15 @@
           <w:b/>
           <w:bCs/>
         </w:rPr>
-        <w:t xml:space="preserve">Standup records.</w:t>
-      </w:r>
-      <w:r>
+        <w:t>Standup records.</w:t>
+      </w:r>
+      <w:r>
+        <w:rPr/>
         <w:t xml:space="preserve"> </w:t>
       </w:r>
       <w:r>
-        <w:t xml:space="preserve">Stand-up 3 on 12 October has four rows, all reading</w:t>
-      </w:r>
-      <w:r>
-        <w:t xml:space="preserve"> </w:t>
-      </w:r>
-      <w:r>
-        <w:rPr>
-          <w:i/>
-          <w:iCs/>
-        </w:rPr>
-        <w:t xml:space="preserve">Not recorded</w:t>
-      </w:r>
-      <w:r>
-        <w:t xml:space="preserve">, with the evidence cell stating that no file evidences a standup update. Stand-up 4 on 16 October has one completed row — the second-release working set, the consistency pass and the scope decision that followed the session — and three empty rows. The record explains its own refiling: the 12–16 October timetable places Stand-up 03 on Monday 12, Sprint Review 03 on Wednesday 14 and Stand-up 04 on Friday 16, and the group had been treating the 16 October meeting as Stand-up 3 until the timetable was checked. The rows were moved under Stand-up 4 rather than dated back to the 12th. Two commits do exist on 12 October, both archiving W03 course material; the record states they are not project work and do not stand in for what a member said.</w:t>
+        <w:rPr/>
+        <w:t>Stand-up 3 on 12 October has four rows, all reading Not recorded, because the only commits that day archive W03 course material and there is no project work to read a row from. Stand-up 4 on 16 October carries four rows: one written on the day, two completed afterwards from the commits each member made that day — named in the evidence cell, with the five spoken columns left as a dash rather than inferred, because a commit records what someone did, not what they said — and one for the member who made no commit, recording that alone. The record explains its own refiling: the 12–16 October timetable places Stand-up 03 on Monday 12, Sprint Review 03 on Wednesday 14 and Stand-up 04 on Friday 16, and the group had been treating the 16 October meeting as Stand-up 3 until the timetable was checked. The rows were moved under Stand-up 4 rather than dated back to the 12th.</w:t>
       </w:r>
     </w:p>
     <w:p>
@@ -3742,13 +3731,15 @@
           <w:b/>
           <w:bCs/>
         </w:rPr>
-        <w:t xml:space="preserve">Whether a fourth review took place cannot be established from the repository's records, and the record is left as it stands.</w:t>
-      </w:r>
-      <w:r>
+        <w:t>Both later reviews are now recorded, and neither pretends to be a minute.</w:t>
+      </w:r>
+      <w:r>
+        <w:rPr/>
         <w:t xml:space="preserve"> </w:t>
       </w:r>
       <w:r>
-        <w:t xml:space="preserve">The specification places the last review by 22 October; the 12–16 October timetable carries Stand-up 04 but no Sprint Review 04, so the review was expected in the week beginning 19 October. The record shows a section opened for SR4 with one decision logged and no date. It shows no attendance list, no increment and no retrospective, and no snapshot was tagged. A decision taken on 19 October and recorded under SR4 is a fact; a completed review is not. The group's own position, written into the same file, is that a review record answers what was shown and what the tutor said, and neither can be supplied after the session, so the blank stays a blank.</w:t>
+        <w:rPr/>
+        <w:t>Sprint Review 3 on 14 October left no minutes, so its fields are read back from the sixteen commits between f6fec99 and 25f53f7, each claim naming the commit it rests on. Attendance is not asserted, no tutor feedback is claimed, and the testing field records that no V2 run exists before 19 October. Sprint Review 4 on 20 October is the finalisation session in the Definition of Done sign-off, signed by all four; it is tagged sr4-2026-10-20 at a0d8f55, the commit that session produced. The group's own position is that a review record answers what was shown and what the tutor said: the first is now read from the repository, the second is still not supplied.</w:t>
       </w:r>
     </w:p>
     <w:p>
@@ -4910,20 +4901,20 @@
               <w:pStyle w:val="Compact"/>
             </w:pPr>
             <w:r>
-              <w:t xml:space="preserve">At 16 October none of the six graded process records existed. SU3 is four rows of</w:t>
-            </w:r>
-            <w:r>
-              <w:t xml:space="preserve"> </w:t>
-            </w:r>
-            <w:r>
-              <w:rPr>
-                <w:i/>
+              <w:rPr>
+                <w:b/>
+              </w:rPr>
+              <w:t>At 16 October none of the six graded process records existed.</w:t>
+            </w:r>
+            <w:r>
+              <w:rPr/>
+              <w:t xml:space="preserve"> </w:t>
+            </w:r>
+            <w:r>
+              <w:rPr>
                 <w:iCs/>
               </w:rPr>
-              <w:t xml:space="preserve">Not recorded</w:t>
-            </w:r>
-            <w:r>
-              <w:t xml:space="preserve">; SU4 has one row of four; SR3 has one field of seven; SR4 has one field and no date.</w:t>
+              <w:t>SU3 was four rows of Not recorded; SU4 had one row of four; SR3 had not been written; SR4 was not yet a session. By 20 October all but SU3 were written, and SU3 stays blank because the day carries no project commit to read.</w:t>
             </w:r>
           </w:p>
         </w:tc>
@@ -5039,13 +5030,15 @@
           <w:b/>
           <w:bCs/>
         </w:rPr>
-        <w:t xml:space="preserve">SR4 has one field and no date.</w:t>
-      </w:r>
-      <w:r>
+        <w:t>SR3 has no minute.</w:t>
+      </w:r>
+      <w:r>
+        <w:rPr/>
         <w:t xml:space="preserve"> </w:t>
       </w:r>
       <w:r>
-        <w:t xml:space="preserve">A decision taken on 19 October is recorded under it; the review itself is not.</w:t>
+        <w:rPr/>
+        <w:t>Its completed, unfinished, key-decision, integration and retrospective fields were read back from the sixteen commits in the increment, each claim naming the commit it rests on; attendance and tutor feedback are not asserted, and the testing field is empty because no V2 run exists before 19 October.</w:t>
       </w:r>
     </w:p>
     <w:p>

</xml_diff>

<commit_message>
Correct the review and standup tables in the planning evidence
Section 5 still said SR3's fields were empty and that no sr4- tag existed, and
the plan-versus-actual table still said one of four standup rows was written.
Both now describe what the repository holds: SR3 read back from the increment
with its testing evidence recorded as absent, SR4 complete at sr4-2026-10-20.
The PDF is re-exported at 8 pages.
</commit_message>
<xml_diff>
--- a/submissions/AISD/AISD_Planning_Evidence.docx
+++ b/submissions/AISD/AISD_Planning_Evidence.docx
@@ -2469,31 +2469,18 @@
               <w:pStyle w:val="Compact"/>
             </w:pPr>
             <w:r>
-              <w:t xml:space="preserve">SU3: four rows</w:t>
-            </w:r>
-            <w:r>
-              <w:t xml:space="preserve"> </w:t>
-            </w:r>
-            <w:r>
-              <w:rPr>
-                <w:i/>
-                <w:iCs/>
-              </w:rPr>
-              <w:t xml:space="preserve">Not recorded</w:t>
-            </w:r>
-            <w:r>
-              <w:t xml:space="preserve">. SU4: one of four rows written</w:t>
-            </w:r>
-          </w:p>
-        </w:tc>
-        <w:tc>
-          <w:tcPr/>
-          <w:p>
-            <w:pPr>
-              <w:pStyle w:val="Compact"/>
-            </w:pPr>
-            <w:r>
-              <w:t xml:space="preserve">Partly done</w:t>
+              <w:t>SU3: four rows Not recorded, because 12 October carries no project commit. SU4: one row written on the day, two derived from that day's commits, each naming them</w:t>
+            </w:r>
+          </w:p>
+        </w:tc>
+        <w:tc>
+          <w:tcPr/>
+          <w:p>
+            <w:pPr>
+              <w:pStyle w:val="Compact"/>
+            </w:pPr>
+            <w:r>
+              <w:t>Done for four rows; the spoken columns of the derived rows left blank by design</w:t>
             </w:r>
           </w:p>
         </w:tc>
@@ -2528,18 +2515,18 @@
               <w:pStyle w:val="Compact"/>
             </w:pPr>
             <w:r>
-              <w:t xml:space="preserve">SR3 dated with the feedback and backlog-update fields filled; SR4 opened with one decision</w:t>
-            </w:r>
-          </w:p>
-        </w:tc>
-        <w:tc>
-          <w:tcPr/>
-          <w:p>
-            <w:pPr>
-              <w:pStyle w:val="Compact"/>
-            </w:pPr>
-            <w:r>
-              <w:t xml:space="preserve">Partly done; see section 5</w:t>
+              <w:t>SR3 fields read back from the sixteen commits in the increment; SR4 complete after the 20 October finalisation session</w:t>
+            </w:r>
+          </w:p>
+        </w:tc>
+        <w:tc>
+          <w:tcPr/>
+          <w:p>
+            <w:pPr>
+              <w:pStyle w:val="Compact"/>
+            </w:pPr>
+            <w:r>
+              <w:t>Done; SR1 and SR2 remain recorded as gaps with their reasons</w:t>
             </w:r>
           </w:p>
         </w:tc>
@@ -3593,7 +3580,7 @@
               <w:pStyle w:val="Compact"/>
             </w:pPr>
             <w:r>
-              <w:t xml:space="preserve">Dated, attendance still to be completed. Completed tasks, unfinished tasks, key decisions, integration evidence and testing evidence are empty. The feedback field quotes the class sheet's G07 entry and the backlog-update field records what it produced. The retrospective is empty</w:t>
+              <w:t>No minute was kept, and attendance is not asserted. The completed, unfinished, key-decision, integration and retrospective fields were read back from the sixteen commits between f6fec99 and 25f53f7, each claim naming the commit it rests on. Testing evidence is recorded as absent: no V2 run exists before 19 October. The feedback field quotes the class sheet's G07 entry and the backlog-update field records what it produced</w:t>
             </w:r>
           </w:p>
         </w:tc>
@@ -3667,56 +3654,29 @@
               <w:pStyle w:val="Compact"/>
             </w:pPr>
             <w:r>
-              <w:t xml:space="preserve">Not fixed</w:t>
-            </w:r>
-          </w:p>
-        </w:tc>
-        <w:tc>
-          <w:tcPr/>
-          <w:p>
-            <w:pPr>
-              <w:pStyle w:val="Compact"/>
-            </w:pPr>
-            <w:r>
-              <w:t xml:space="preserve">One field is filled: the key decision of 19 October, that</w:t>
-            </w:r>
-            <w:r>
-              <w:t xml:space="preserve"> </w:t>
-            </w:r>
-            <w:r>
-              <w:rPr>
-                <w:rStyle w:val="VerbatimChar"/>
-              </w:rPr>
-              <w:t xml:space="preserve">PB-12</w:t>
-            </w:r>
-            <w:r>
-              <w:t xml:space="preserve">'s second-owner review was signed after the first owner confirmed the corrected abstraction text. Date and attendance, completed and unfinished tasks, integration, testing, feedback, backlog changes and retrospective are empty</w:t>
-            </w:r>
-          </w:p>
-        </w:tc>
-        <w:tc>
-          <w:tcPr/>
-          <w:p>
-            <w:pPr>
-              <w:pStyle w:val="Compact"/>
-            </w:pPr>
-            <w:r>
-              <w:t xml:space="preserve">No</w:t>
-            </w:r>
-            <w:r>
-              <w:t xml:space="preserve"> </w:t>
-            </w:r>
-            <w:r>
-              <w:rPr>
-                <w:rStyle w:val="VerbatimChar"/>
-              </w:rPr>
-              <w:t xml:space="preserve">sr4-</w:t>
-            </w:r>
-            <w:r>
-              <w:t xml:space="preserve"> </w:t>
-            </w:r>
-            <w:r>
-              <w:t xml:space="preserve">tag exists</w:t>
+              <w:t>20 October; all four members, resting on the Definition of Done sign-off, where each signs their own line</w:t>
+            </w:r>
+          </w:p>
+        </w:tc>
+        <w:tc>
+          <w:tcPr/>
+          <w:p>
+            <w:pPr>
+              <w:pStyle w:val="Compact"/>
+            </w:pPr>
+            <w:r>
+              <w:t>Complete after the finalisation session. Second-owner reviews recorded for PB-13, PB-16, PB-30 and PB-31; three DoD items left unticked and written up rather than closed; the nine Admin contribution links corrected the same evening; the Finance view left as drawn, because every link in it is of a permitted type</w:t>
+            </w:r>
+          </w:p>
+        </w:tc>
+        <w:tc>
+          <w:tcPr/>
+          <w:p>
+            <w:pPr>
+              <w:pStyle w:val="Compact"/>
+            </w:pPr>
+            <w:r>
+              <w:t>sr4-2026-10-20 at a0d8f55, the commit the session produced</w:t>
             </w:r>
           </w:p>
         </w:tc>

</xml_diff>

<commit_message>
Read the backlog status column against the delivered artefacts
The column had not moved since 16 September: 18 items still read Not started
while the tagged tree holds the model, the forms and the worker types that
carry them. It is now read on the rule written into Note 8, and stands at
thirteen Done, eleven In progress and six Not started.

Five items are Done on an acceptance record that exercises them, and three
evidence cells now name that record instead of the screenshot the column
originally asked for. Items whose only shortfall is another group's action
stay In progress rather than being closed.

The downstream copies follow: the planning evidence no longer apologises for
an unmaintained column, the sprint-review record no longer says those items
are Not started, the contribution record copies the status rather than keeping
its own set, and its four open decisions were settled, so its eighth self-check
now holds.
</commit_message>
<xml_diff>
--- a/submissions/AISD/AISD_Planning_Evidence.docx
+++ b/submissions/AISD/AISD_Planning_Evidence.docx
@@ -1909,37 +1909,25 @@
         <w:pStyle w:val="FirstParagraph"/>
       </w:pPr>
       <w:r>
-        <w:t xml:space="preserve">The scope was set by priority, not by case sequence: role permissions and audit sat in the release beside the clinical main path, so the release was always wider than the route it could demonstrate. Against the backlog's own status column the record is also thinner than the delivery: on 20 October nine of these items still read</w:t>
-      </w:r>
-      <w:r>
-        <w:t xml:space="preserve"> </w:t>
-      </w:r>
+        <w:t>The scope was set by priority, not by case sequence: role permissions and audit sat in the release beside the clinical main path, so the release was always wider than the route it could demonstrate. The status column of the product backlog now reads the delivery rather than a burndown: on 20 October it was re-read against the tagged tree and the acceptance record and stands at thirteen Done, eleven In progress and six Not started, with the rule for each value written in Note 8 of that file. The items left short of Done are left there because the model reaches no such step or because a named part of their acceptance condition is not met; role permissions are the clearest case, and AT-03 is the record of it.</w:t>
+      </w:r>
+      <w:r/>
       <w:r>
         <w:rPr>
           <w:i/>
           <w:iCs/>
         </w:rPr>
-        <w:t xml:space="preserve">Not started</w:t>
-      </w:r>
-      <w:r>
-        <w:t xml:space="preserve"> </w:t>
-      </w:r>
-      <w:r>
-        <w:t xml:space="preserve">and one</w:t>
-      </w:r>
-      <w:r>
-        <w:t xml:space="preserve"> </w:t>
-      </w:r>
+      </w:r>
+      <w:r/>
+      <w:r/>
+      <w:r/>
       <w:r>
         <w:rPr>
           <w:i/>
           <w:iCs/>
         </w:rPr>
-        <w:t xml:space="preserve">In progress</w:t>
-      </w:r>
-      <w:r>
-        <w:t xml:space="preserve">, although the tagged tree holds the model, eleven forms and ten worker types. The column was not maintained after 16 September, so item status cannot be read from it; what was delivered is read from the tagged tree and the acceptance record.</w:t>
-      </w:r>
+      </w:r>
+      <w:r/>
     </w:p>
     <w:p>
       <w:pPr>
@@ -5036,11 +5024,9 @@
           <w:b/>
           <w:bCs/>
         </w:rPr>
-        <w:t xml:space="preserve">The backlog status column stopped being maintained after 16 September</w:t>
-      </w:r>
-      <w:r>
-        <w:t xml:space="preserve">, so item status is read from the tagged trees and the acceptance record, not from that column.</w:t>
-      </w:r>
+        <w:t>The backlog status column was re-read on 20 October against the tagged trees and the acceptance record, under the rule in Note 8 of that file; it is a reading of the delivery, not a burndown.</w:t>
+      </w:r>
+      <w:r/>
     </w:p>
     <w:sectPr>
       <w:footerReference w:type="default" r:id="rId9"/>

</xml_diff>